<commit_message>
style: remove 2nd declaration page from PDF and Word project reports
</commit_message>
<xml_diff>
--- a/CloudShield_Complete_Project_Report.docx
+++ b/CloudShield_Complete_Project_Report.docx
@@ -183,235 +183,6 @@
           <w:sz w:val="22"/>
         </w:rPr>
         <w:t>Fall 2026-27</w:t>
-      </w:r>
-    </w:p>
-    <w:p>
-      <w:r>
-        <w:br w:type="page"/>
-      </w:r>
-    </w:p>
-    <w:p>
-      <w:pPr>
-        <w:pStyle w:val="Heading1"/>
-        <w:spacing w:after="320"/>
-      </w:pPr>
-      <w:r>
-        <w:t>DECLARATION</w:t>
-      </w:r>
-    </w:p>
-    <w:p>
-      <w:pPr>
-        <w:spacing w:line="276" w:lineRule="auto" w:after="120"/>
-        <w:jc w:val="both"/>
-      </w:pPr>
-      <w:r>
-        <w:rPr>
-          <w:rFonts w:ascii="Times New Roman" w:hAnsi="Times New Roman"/>
-          <w:b w:val="0"/>
-          <w:i w:val="0"/>
-          <w:color w:val="000000"/>
-          <w:sz w:val="24"/>
-        </w:rPr>
-        <w:t>I hereby declare that the capstone project report titled "A Practical Cloud Architecture Design: CloudShield — Predictive Disaster Resource and Logistic Allocation System", submitted in partial fulfillment of the requirements for BCSE355L – Cloud Architecture Design, is my original work.</w:t>
-      </w:r>
-    </w:p>
-    <w:p>
-      <w:pPr>
-        <w:spacing w:line="276" w:lineRule="auto" w:after="120"/>
-        <w:jc w:val="both"/>
-      </w:pPr>
-      <w:r>
-        <w:rPr>
-          <w:rFonts w:ascii="Times New Roman" w:hAnsi="Times New Roman"/>
-          <w:b w:val="0"/>
-          <w:i w:val="0"/>
-          <w:color w:val="000000"/>
-          <w:sz w:val="24"/>
-        </w:rPr>
-        <w:t>I affirm that this report has been prepared collaboratively and has not been submitted, either in part or in full, to any other course, institution, or university for the award of any degree, diploma, or academic certification.</w:t>
-      </w:r>
-    </w:p>
-    <w:p>
-      <w:pPr>
-        <w:spacing w:after="80"/>
-      </w:pPr>
-      <w:r>
-        <w:t>I further declare that:</w:t>
-      </w:r>
-    </w:p>
-    <w:p>
-      <w:pPr>
-        <w:spacing w:after="80" w:line="276" w:lineRule="auto"/>
-        <w:ind w:left="360"/>
-        <w:jc w:val="both"/>
-      </w:pPr>
-      <w:r>
-        <w:rPr>
-          <w:rFonts w:ascii="Times New Roman" w:hAnsi="Times New Roman"/>
-          <w:b w:val="0"/>
-          <w:i w:val="0"/>
-          <w:color w:val="000000"/>
-          <w:sz w:val="24"/>
-        </w:rPr>
-        <w:t>•  All sources of technical information, system architectures, and cloud service documentation have been acknowledged and cited using standard academic referencing.</w:t>
-      </w:r>
-    </w:p>
-    <w:p>
-      <w:pPr>
-        <w:spacing w:after="80" w:line="276" w:lineRule="auto"/>
-        <w:ind w:left="360"/>
-        <w:jc w:val="both"/>
-      </w:pPr>
-      <w:r>
-        <w:rPr>
-          <w:rFonts w:ascii="Times New Roman" w:hAnsi="Times New Roman"/>
-          <w:b w:val="0"/>
-          <w:i w:val="0"/>
-          <w:color w:val="000000"/>
-          <w:sz w:val="24"/>
-        </w:rPr>
-        <w:t>•  Figures, structural diagrams, benchmark scripts, and analytical models taken from external sources or technical literature are appropriately credited and documented.</w:t>
-      </w:r>
-    </w:p>
-    <w:p>
-      <w:pPr>
-        <w:spacing w:after="80" w:line="276" w:lineRule="auto"/>
-        <w:ind w:left="360"/>
-        <w:jc w:val="both"/>
-      </w:pPr>
-      <w:r>
-        <w:rPr>
-          <w:rFonts w:ascii="Times New Roman" w:hAnsi="Times New Roman"/>
-          <w:b w:val="0"/>
-          <w:i w:val="0"/>
-          <w:color w:val="000000"/>
-          <w:sz w:val="24"/>
-        </w:rPr>
-        <w:t>•  The architectural analysis, algorithmic breakdown, and technical evaluation represent my own conceptual understanding and academic synthesis, except where explicitly stated.</w:t>
-      </w:r>
-    </w:p>
-    <w:p>
-      <w:pPr>
-        <w:spacing w:after="80" w:line="276" w:lineRule="auto"/>
-        <w:ind w:left="360"/>
-        <w:jc w:val="both"/>
-      </w:pPr>
-      <w:r>
-        <w:rPr>
-          <w:rFonts w:ascii="Times New Roman" w:hAnsi="Times New Roman"/>
-          <w:b w:val="0"/>
-          <w:i w:val="0"/>
-          <w:color w:val="000000"/>
-          <w:sz w:val="24"/>
-        </w:rPr>
-        <w:t>•  Any academic or technical assistance received during the conceptualization, execution, and preparation of this report has been duly acknowledged.</w:t>
-      </w:r>
-    </w:p>
-    <w:p>
-      <w:pPr>
-        <w:spacing w:before="360" w:after="0"/>
-      </w:pPr>
-    </w:p>
-    <w:p>
-      <w:pPr>
-        <w:spacing w:after="280"/>
-      </w:pPr>
-      <w:r>
-        <w:rPr>
-          <w:rFonts w:ascii="Times New Roman" w:hAnsi="Times New Roman"/>
-          <w:b/>
-          <w:i w:val="0"/>
-          <w:color w:val="000000"/>
-          <w:sz w:val="24"/>
-        </w:rPr>
-        <w:t>Student Name:</w:t>
-      </w:r>
-      <w:r>
-        <w:rPr>
-          <w:rFonts w:ascii="Times New Roman" w:hAnsi="Times New Roman"/>
-          <w:b w:val="0"/>
-          <w:i w:val="0"/>
-          <w:color w:val="000000"/>
-          <w:sz w:val="24"/>
-        </w:rPr>
-        <w:t xml:space="preserve">    Neelesh A</w:t>
-      </w:r>
-      <w:r>
-        <w:br/>
-      </w:r>
-      <w:r>
-        <w:rPr>
-          <w:rFonts w:ascii="Times New Roman" w:hAnsi="Times New Roman"/>
-          <w:b/>
-          <w:i w:val="0"/>
-          <w:color w:val="000000"/>
-          <w:sz w:val="24"/>
-        </w:rPr>
-        <w:t>Register Number:</w:t>
-      </w:r>
-      <w:r>
-        <w:rPr>
-          <w:rFonts w:ascii="Times New Roman" w:hAnsi="Times New Roman"/>
-          <w:b w:val="0"/>
-          <w:i w:val="0"/>
-          <w:color w:val="000000"/>
-          <w:sz w:val="24"/>
-        </w:rPr>
-        <w:t xml:space="preserve">  24BIT0437</w:t>
-      </w:r>
-    </w:p>
-    <w:p>
-      <w:pPr>
-        <w:spacing w:after="120"/>
-      </w:pPr>
-      <w:r>
-        <w:rPr>
-          <w:rFonts w:ascii="Times New Roman" w:hAnsi="Times New Roman"/>
-          <w:b/>
-          <w:i w:val="0"/>
-          <w:color w:val="000000"/>
-          <w:sz w:val="24"/>
-        </w:rPr>
-        <w:t>Signature:</w:t>
-      </w:r>
-    </w:p>
-    <w:p>
-      <w:pPr>
-        <w:spacing w:after="0"/>
-      </w:pPr>
-      <w:r>
-        <w:drawing>
-          <wp:inline xmlns:a="http://schemas.openxmlformats.org/drawingml/2006/main" xmlns:pic="http://schemas.openxmlformats.org/drawingml/2006/picture">
-            <wp:extent cx="1371600" cy="544058"/>
-            <wp:docPr id="2" name="Picture 2"/>
-            <wp:cNvGraphicFramePr>
-              <a:graphicFrameLocks noChangeAspect="1"/>
-            </wp:cNvGraphicFramePr>
-            <a:graphic>
-              <a:graphicData uri="http://schemas.openxmlformats.org/drawingml/2006/picture">
-                <pic:pic>
-                  <pic:nvPicPr>
-                    <pic:cNvPr id="0" name="neelesh_signature.png"/>
-                    <pic:cNvPicPr/>
-                  </pic:nvPicPr>
-                  <pic:blipFill>
-                    <a:blip r:embed="rId12"/>
-                    <a:stretch>
-                      <a:fillRect/>
-                    </a:stretch>
-                  </pic:blipFill>
-                  <pic:spPr>
-                    <a:xfrm>
-                      <a:off x="0" y="0"/>
-                      <a:ext cx="1371600" cy="544058"/>
-                    </a:xfrm>
-                    <a:prstGeom prst="rect"/>
-                  </pic:spPr>
-                </pic:pic>
-              </a:graphicData>
-            </a:graphic>
-          </wp:inline>
-        </w:drawing>
       </w:r>
     </w:p>
     <w:p>
@@ -632,7 +403,7 @@
                 <w:color w:val="000000"/>
                 <w:sz w:val="17"/>
               </w:rPr>
-              <w:t>4</w:t>
+              <w:t>3</w:t>
             </w:r>
           </w:p>
         </w:tc>
@@ -742,7 +513,7 @@
                 <w:color w:val="000000"/>
                 <w:sz w:val="17"/>
               </w:rPr>
-              <w:t>5</w:t>
+              <w:t>4</w:t>
             </w:r>
           </w:p>
         </w:tc>
@@ -852,7 +623,7 @@
                 <w:color w:val="000000"/>
                 <w:sz w:val="17"/>
               </w:rPr>
-              <w:t>8</w:t>
+              <w:t>7</w:t>
             </w:r>
           </w:p>
         </w:tc>
@@ -962,7 +733,7 @@
                 <w:color w:val="000000"/>
                 <w:sz w:val="17"/>
               </w:rPr>
-              <w:t>10</w:t>
+              <w:t>9</w:t>
             </w:r>
           </w:p>
         </w:tc>
@@ -1072,7 +843,7 @@
                 <w:color w:val="000000"/>
                 <w:sz w:val="17"/>
               </w:rPr>
-              <w:t>13</w:t>
+              <w:t>12</w:t>
             </w:r>
           </w:p>
         </w:tc>
@@ -1182,7 +953,7 @@
                 <w:color w:val="000000"/>
                 <w:sz w:val="17"/>
               </w:rPr>
-              <w:t>16</w:t>
+              <w:t>15</w:t>
             </w:r>
           </w:p>
         </w:tc>
@@ -1292,7 +1063,7 @@
                 <w:color w:val="000000"/>
                 <w:sz w:val="17"/>
               </w:rPr>
-              <w:t>19</w:t>
+              <w:t>18</w:t>
             </w:r>
           </w:p>
         </w:tc>
@@ -1402,7 +1173,7 @@
                 <w:color w:val="000000"/>
                 <w:sz w:val="17"/>
               </w:rPr>
-              <w:t>21</w:t>
+              <w:t>20</w:t>
             </w:r>
           </w:p>
         </w:tc>
@@ -1512,7 +1283,7 @@
                 <w:color w:val="000000"/>
                 <w:sz w:val="17"/>
               </w:rPr>
-              <w:t>25</w:t>
+              <w:t>24</w:t>
             </w:r>
           </w:p>
         </w:tc>
@@ -1622,7 +1393,7 @@
                 <w:color w:val="000000"/>
                 <w:sz w:val="17"/>
               </w:rPr>
-              <w:t>27</w:t>
+              <w:t>26</w:t>
             </w:r>
           </w:p>
         </w:tc>
@@ -1732,7 +1503,7 @@
                 <w:color w:val="000000"/>
                 <w:sz w:val="17"/>
               </w:rPr>
-              <w:t>33</w:t>
+              <w:t>32</w:t>
             </w:r>
           </w:p>
         </w:tc>
@@ -1842,7 +1613,7 @@
                 <w:color w:val="000000"/>
                 <w:sz w:val="17"/>
               </w:rPr>
-              <w:t>35</w:t>
+              <w:t>34</w:t>
             </w:r>
           </w:p>
         </w:tc>
@@ -1952,7 +1723,7 @@
                 <w:color w:val="000000"/>
                 <w:sz w:val="17"/>
               </w:rPr>
-              <w:t>38</w:t>
+              <w:t>37</w:t>
             </w:r>
           </w:p>
         </w:tc>
@@ -2062,7 +1833,7 @@
                 <w:color w:val="000000"/>
                 <w:sz w:val="17"/>
               </w:rPr>
-              <w:t>39</w:t>
+              <w:t>38</w:t>
             </w:r>
           </w:p>
         </w:tc>
@@ -3593,7 +3364,7 @@
         <w:drawing>
           <wp:inline xmlns:a="http://schemas.openxmlformats.org/drawingml/2006/main" xmlns:pic="http://schemas.openxmlformats.org/drawingml/2006/picture">
             <wp:extent cx="5303520" cy="3182112"/>
-            <wp:docPr id="3" name="Picture 3"/>
+            <wp:docPr id="2" name="Picture 2"/>
             <wp:cNvGraphicFramePr>
               <a:graphicFrameLocks noChangeAspect="1"/>
             </wp:cNvGraphicFramePr>
@@ -3605,7 +3376,7 @@
                     <pic:cNvPicPr/>
                   </pic:nvPicPr>
                   <pic:blipFill>
-                    <a:blip r:embed="rId13"/>
+                    <a:blip r:embed="rId12"/>
                     <a:stretch>
                       <a:fillRect/>
                     </a:stretch>
@@ -5621,7 +5392,7 @@
         <w:drawing>
           <wp:inline xmlns:a="http://schemas.openxmlformats.org/drawingml/2006/main" xmlns:pic="http://schemas.openxmlformats.org/drawingml/2006/picture">
             <wp:extent cx="5303520" cy="2386584"/>
-            <wp:docPr id="4" name="Picture 4"/>
+            <wp:docPr id="3" name="Picture 3"/>
             <wp:cNvGraphicFramePr>
               <a:graphicFrameLocks noChangeAspect="1"/>
             </wp:cNvGraphicFramePr>
@@ -5633,7 +5404,7 @@
                     <pic:cNvPicPr/>
                   </pic:nvPicPr>
                   <pic:blipFill>
-                    <a:blip r:embed="rId14"/>
+                    <a:blip r:embed="rId13"/>
                     <a:stretch>
                       <a:fillRect/>
                     </a:stretch>
@@ -6238,7 +6009,7 @@
         <w:drawing>
           <wp:inline xmlns:a="http://schemas.openxmlformats.org/drawingml/2006/main" xmlns:pic="http://schemas.openxmlformats.org/drawingml/2006/picture">
             <wp:extent cx="5303520" cy="2386584"/>
-            <wp:docPr id="5" name="Picture 5"/>
+            <wp:docPr id="4" name="Picture 4"/>
             <wp:cNvGraphicFramePr>
               <a:graphicFrameLocks noChangeAspect="1"/>
             </wp:cNvGraphicFramePr>
@@ -6250,7 +6021,7 @@
                     <pic:cNvPicPr/>
                   </pic:nvPicPr>
                   <pic:blipFill>
-                    <a:blip r:embed="rId15"/>
+                    <a:blip r:embed="rId14"/>
                     <a:stretch>
                       <a:fillRect/>
                     </a:stretch>
@@ -6877,7 +6648,7 @@
         <w:drawing>
           <wp:inline xmlns:a="http://schemas.openxmlformats.org/drawingml/2006/main" xmlns:pic="http://schemas.openxmlformats.org/drawingml/2006/picture">
             <wp:extent cx="5303520" cy="2386584"/>
-            <wp:docPr id="6" name="Picture 6"/>
+            <wp:docPr id="5" name="Picture 5"/>
             <wp:cNvGraphicFramePr>
               <a:graphicFrameLocks noChangeAspect="1"/>
             </wp:cNvGraphicFramePr>
@@ -6889,7 +6660,7 @@
                     <pic:cNvPicPr/>
                   </pic:nvPicPr>
                   <pic:blipFill>
-                    <a:blip r:embed="rId16"/>
+                    <a:blip r:embed="rId15"/>
                     <a:stretch>
                       <a:fillRect/>
                     </a:stretch>
@@ -8413,7 +8184,7 @@
         <w:drawing>
           <wp:inline xmlns:a="http://schemas.openxmlformats.org/drawingml/2006/main" xmlns:pic="http://schemas.openxmlformats.org/drawingml/2006/picture">
             <wp:extent cx="5303520" cy="2386584"/>
-            <wp:docPr id="7" name="Picture 7"/>
+            <wp:docPr id="6" name="Picture 6"/>
             <wp:cNvGraphicFramePr>
               <a:graphicFrameLocks noChangeAspect="1"/>
             </wp:cNvGraphicFramePr>
@@ -8425,7 +8196,7 @@
                     <pic:cNvPicPr/>
                   </pic:nvPicPr>
                   <pic:blipFill>
-                    <a:blip r:embed="rId17"/>
+                    <a:blip r:embed="rId16"/>
                     <a:stretch>
                       <a:fillRect/>
                     </a:stretch>
@@ -8705,7 +8476,7 @@
         <w:drawing>
           <wp:inline xmlns:a="http://schemas.openxmlformats.org/drawingml/2006/main" xmlns:pic="http://schemas.openxmlformats.org/drawingml/2006/picture">
             <wp:extent cx="5303520" cy="2916936"/>
-            <wp:docPr id="8" name="Picture 8"/>
+            <wp:docPr id="7" name="Picture 7"/>
             <wp:cNvGraphicFramePr>
               <a:graphicFrameLocks noChangeAspect="1"/>
             </wp:cNvGraphicFramePr>
@@ -8717,7 +8488,7 @@
                     <pic:cNvPicPr/>
                   </pic:nvPicPr>
                   <pic:blipFill>
-                    <a:blip r:embed="rId18"/>
+                    <a:blip r:embed="rId17"/>
                     <a:stretch>
                       <a:fillRect/>
                     </a:stretch>
@@ -12051,7 +11822,7 @@
         <w:drawing>
           <wp:inline xmlns:a="http://schemas.openxmlformats.org/drawingml/2006/main" xmlns:pic="http://schemas.openxmlformats.org/drawingml/2006/picture">
             <wp:extent cx="5303520" cy="2386584"/>
-            <wp:docPr id="9" name="Picture 9"/>
+            <wp:docPr id="8" name="Picture 8"/>
             <wp:cNvGraphicFramePr>
               <a:graphicFrameLocks noChangeAspect="1"/>
             </wp:cNvGraphicFramePr>
@@ -12063,7 +11834,7 @@
                     <pic:cNvPicPr/>
                   </pic:nvPicPr>
                   <pic:blipFill>
-                    <a:blip r:embed="rId19"/>
+                    <a:blip r:embed="rId18"/>
                     <a:stretch>
                       <a:fillRect/>
                     </a:stretch>
@@ -12401,6 +12172,91 @@
         <w:drawing>
           <wp:inline xmlns:a="http://schemas.openxmlformats.org/drawingml/2006/main" xmlns:pic="http://schemas.openxmlformats.org/drawingml/2006/picture">
             <wp:extent cx="5303520" cy="3107531"/>
+            <wp:docPr id="9" name="Picture 9"/>
+            <wp:cNvGraphicFramePr>
+              <a:graphicFrameLocks noChangeAspect="1"/>
+            </wp:cNvGraphicFramePr>
+            <a:graphic>
+              <a:graphicData uri="http://schemas.openxmlformats.org/drawingml/2006/picture">
+                <pic:pic>
+                  <pic:nvPicPr>
+                    <pic:cNvPr id="0" name="ui_1_intake_and_dpri.png"/>
+                    <pic:cNvPicPr/>
+                  </pic:nvPicPr>
+                  <pic:blipFill>
+                    <a:blip r:embed="rId19"/>
+                    <a:stretch>
+                      <a:fillRect/>
+                    </a:stretch>
+                  </pic:blipFill>
+                  <pic:spPr>
+                    <a:xfrm>
+                      <a:off x="0" y="0"/>
+                      <a:ext cx="5303520" cy="3107531"/>
+                    </a:xfrm>
+                    <a:prstGeom prst="rect"/>
+                  </pic:spPr>
+                </pic:pic>
+              </a:graphicData>
+            </a:graphic>
+          </wp:inline>
+        </w:drawing>
+      </w:r>
+    </w:p>
+    <w:p>
+      <w:pPr>
+        <w:spacing w:before="40" w:after="160" w:line="276" w:lineRule="auto"/>
+        <w:jc w:val="center"/>
+      </w:pPr>
+      <w:r>
+        <w:rPr>
+          <w:rFonts w:ascii="Times New Roman" w:hAnsi="Times New Roman"/>
+          <w:b/>
+          <w:i w:val="0"/>
+          <w:color w:val="000000"/>
+          <w:sz w:val="21"/>
+        </w:rPr>
+        <w:t>Figure 9.1: Real-Time Disaster Intake Sliders, Rapid Presets &amp; Regional DPRI Urgency Heatmap.</w:t>
+      </w:r>
+      <w:r>
+        <w:br/>
+      </w:r>
+      <w:r>
+        <w:rPr>
+          <w:rFonts w:ascii="Times New Roman" w:hAnsi="Times New Roman"/>
+          <w:b w:val="0"/>
+          <w:i/>
+          <w:color w:val="000000"/>
+          <w:sz w:val="21"/>
+        </w:rPr>
+        <w:t>Operational Walkthrough:</w:t>
+      </w:r>
+      <w:r>
+        <w:rPr>
+          <w:rFonts w:ascii="Times New Roman" w:hAnsi="Times New Roman"/>
+          <w:b w:val="0"/>
+          <w:i w:val="0"/>
+          <w:color w:val="000000"/>
+          <w:sz w:val="21"/>
+        </w:rPr>
+        <w:t xml:space="preserve"> In this opening panel, the emergency coordinator configures live hazard telemetry either manually using real-time sliders or by selecting predefined historical scenario presets (e.g., 'Severe Cyclone Landfall', 'Flash Flood Deluge'). Parameters include flood water depth (meters), access road blockage severity (0–100%), displaced population count, and the vulnerable demographic ratio. As sliders move, the client updates the DPRI urgency meter in real time without page reloads. In the displayed state, Region Delta has reached an acute DPRI score of 0.82, visually flagged in vibrant crimson to immediately focus command center attention where lives are most severely threatened.</w:t>
+      </w:r>
+    </w:p>
+    <w:p>
+      <w:r>
+        <w:br w:type="page"/>
+      </w:r>
+    </w:p>
+    <w:p>
+      <w:pPr>
+        <w:keepNext/>
+        <w:spacing w:before="160" w:after="80"/>
+        <w:jc w:val="center"/>
+      </w:pPr>
+      <w:r>
+        <w:drawing>
+          <wp:inline xmlns:a="http://schemas.openxmlformats.org/drawingml/2006/main" xmlns:pic="http://schemas.openxmlformats.org/drawingml/2006/picture">
+            <wp:extent cx="5303520" cy="3107531"/>
             <wp:docPr id="10" name="Picture 10"/>
             <wp:cNvGraphicFramePr>
               <a:graphicFrameLocks noChangeAspect="1"/>
@@ -12409,7 +12265,7 @@
               <a:graphicData uri="http://schemas.openxmlformats.org/drawingml/2006/picture">
                 <pic:pic>
                   <pic:nvPicPr>
-                    <pic:cNvPr id="0" name="ui_1_intake_and_dpri.png"/>
+                    <pic:cNvPr id="0" name="ui_2_shortage_and_manifest.png"/>
                     <pic:cNvPicPr/>
                   </pic:nvPicPr>
                   <pic:blipFill>
@@ -12445,7 +12301,7 @@
           <w:color w:val="000000"/>
           <w:sz w:val="21"/>
         </w:rPr>
-        <w:t>Figure 9.1: Real-Time Disaster Intake Sliders, Rapid Presets &amp; Regional DPRI Urgency Heatmap.</w:t>
+        <w:t>Figure 9.2: Sphere Standards Demand Prediction, Critical Shortage Ledger &amp; Multi-Depot Allocation Manifest.</w:t>
       </w:r>
       <w:r>
         <w:br/>
@@ -12468,7 +12324,7 @@
           <w:color w:val="000000"/>
           <w:sz w:val="21"/>
         </w:rPr>
-        <w:t xml:space="preserve"> In this opening panel, the emergency coordinator configures live hazard telemetry either manually using real-time sliders or by selecting predefined historical scenario presets (e.g., 'Severe Cyclone Landfall', 'Flash Flood Deluge'). Parameters include flood water depth (meters), access road blockage severity (0–100%), displaced population count, and the vulnerable demographic ratio. As sliders move, the client updates the DPRI urgency meter in real time without page reloads. In the displayed state, Region Delta has reached an acute DPRI score of 0.82, visually flagged in vibrant crimson to immediately focus command center attention where lives are most severely threatened.</w:t>
+        <w:t xml:space="preserve"> This central console translates abstract disaster hazard into precise human survival requirements. The upper table applies Sphere Humanitarian Standard formulas across all affected zones, contrasting predicted demand against available stock to calculate acute shortages (e.g., highlighting an immediate 2,500 L drinking water shortage and a 40-tent deficit in Region Delta). The lower table displays the multi-depot allocation manifest generated by the knapsack optimization engine. Supplies are dynamically pooled from Central Depot and East Auxiliary Depot, optimizing transit distances while strictly reserving baseline emergency buffer stocks.</w:t>
       </w:r>
     </w:p>
     <w:p>
@@ -12485,93 +12341,8 @@
       <w:r>
         <w:drawing>
           <wp:inline xmlns:a="http://schemas.openxmlformats.org/drawingml/2006/main" xmlns:pic="http://schemas.openxmlformats.org/drawingml/2006/picture">
-            <wp:extent cx="5303520" cy="3107531"/>
+            <wp:extent cx="5303520" cy="3729038"/>
             <wp:docPr id="11" name="Picture 11"/>
-            <wp:cNvGraphicFramePr>
-              <a:graphicFrameLocks noChangeAspect="1"/>
-            </wp:cNvGraphicFramePr>
-            <a:graphic>
-              <a:graphicData uri="http://schemas.openxmlformats.org/drawingml/2006/picture">
-                <pic:pic>
-                  <pic:nvPicPr>
-                    <pic:cNvPr id="0" name="ui_2_shortage_and_manifest.png"/>
-                    <pic:cNvPicPr/>
-                  </pic:nvPicPr>
-                  <pic:blipFill>
-                    <a:blip r:embed="rId21"/>
-                    <a:stretch>
-                      <a:fillRect/>
-                    </a:stretch>
-                  </pic:blipFill>
-                  <pic:spPr>
-                    <a:xfrm>
-                      <a:off x="0" y="0"/>
-                      <a:ext cx="5303520" cy="3107531"/>
-                    </a:xfrm>
-                    <a:prstGeom prst="rect"/>
-                  </pic:spPr>
-                </pic:pic>
-              </a:graphicData>
-            </a:graphic>
-          </wp:inline>
-        </w:drawing>
-      </w:r>
-    </w:p>
-    <w:p>
-      <w:pPr>
-        <w:spacing w:before="40" w:after="160" w:line="276" w:lineRule="auto"/>
-        <w:jc w:val="center"/>
-      </w:pPr>
-      <w:r>
-        <w:rPr>
-          <w:rFonts w:ascii="Times New Roman" w:hAnsi="Times New Roman"/>
-          <w:b/>
-          <w:i w:val="0"/>
-          <w:color w:val="000000"/>
-          <w:sz w:val="21"/>
-        </w:rPr>
-        <w:t>Figure 9.2: Sphere Standards Demand Prediction, Critical Shortage Ledger &amp; Multi-Depot Allocation Manifest.</w:t>
-      </w:r>
-      <w:r>
-        <w:br/>
-      </w:r>
-      <w:r>
-        <w:rPr>
-          <w:rFonts w:ascii="Times New Roman" w:hAnsi="Times New Roman"/>
-          <w:b w:val="0"/>
-          <w:i/>
-          <w:color w:val="000000"/>
-          <w:sz w:val="21"/>
-        </w:rPr>
-        <w:t>Operational Walkthrough:</w:t>
-      </w:r>
-      <w:r>
-        <w:rPr>
-          <w:rFonts w:ascii="Times New Roman" w:hAnsi="Times New Roman"/>
-          <w:b w:val="0"/>
-          <w:i w:val="0"/>
-          <w:color w:val="000000"/>
-          <w:sz w:val="21"/>
-        </w:rPr>
-        <w:t xml:space="preserve"> This central console translates abstract disaster hazard into precise human survival requirements. The upper table applies Sphere Humanitarian Standard formulas across all affected zones, contrasting predicted demand against available stock to calculate acute shortages (e.g., highlighting an immediate 2,500 L drinking water shortage and a 40-tent deficit in Region Delta). The lower table displays the multi-depot allocation manifest generated by the knapsack optimization engine. Supplies are dynamically pooled from Central Depot and East Auxiliary Depot, optimizing transit distances while strictly reserving baseline emergency buffer stocks.</w:t>
-      </w:r>
-    </w:p>
-    <w:p>
-      <w:r>
-        <w:br w:type="page"/>
-      </w:r>
-    </w:p>
-    <w:p>
-      <w:pPr>
-        <w:keepNext/>
-        <w:spacing w:before="160" w:after="80"/>
-        <w:jc w:val="center"/>
-      </w:pPr>
-      <w:r>
-        <w:drawing>
-          <wp:inline xmlns:a="http://schemas.openxmlformats.org/drawingml/2006/main" xmlns:pic="http://schemas.openxmlformats.org/drawingml/2006/picture">
-            <wp:extent cx="5303520" cy="3729038"/>
-            <wp:docPr id="12" name="Picture 12"/>
             <wp:cNvGraphicFramePr>
               <a:graphicFrameLocks noChangeAspect="1"/>
             </wp:cNvGraphicFramePr>
@@ -12583,7 +12354,7 @@
                     <pic:cNvPicPr/>
                   </pic:nvPicPr>
                   <pic:blipFill>
-                    <a:blip r:embed="rId22"/>
+                    <a:blip r:embed="rId21"/>
                     <a:stretch>
                       <a:fillRect/>
                     </a:stretch>
@@ -12656,7 +12427,7 @@
         <w:drawing>
           <wp:inline xmlns:a="http://schemas.openxmlformats.org/drawingml/2006/main" xmlns:pic="http://schemas.openxmlformats.org/drawingml/2006/picture">
             <wp:extent cx="5303520" cy="3314700"/>
-            <wp:docPr id="13" name="Picture 13"/>
+            <wp:docPr id="12" name="Picture 12"/>
             <wp:cNvGraphicFramePr>
               <a:graphicFrameLocks noChangeAspect="1"/>
             </wp:cNvGraphicFramePr>
@@ -12668,7 +12439,7 @@
                     <pic:cNvPicPr/>
                   </pic:nvPicPr>
                   <pic:blipFill>
-                    <a:blip r:embed="rId23"/>
+                    <a:blip r:embed="rId22"/>
                     <a:stretch>
                       <a:fillRect/>
                     </a:stretch>
@@ -12761,7 +12532,7 @@
         <w:drawing>
           <wp:inline xmlns:a="http://schemas.openxmlformats.org/drawingml/2006/main" xmlns:pic="http://schemas.openxmlformats.org/drawingml/2006/picture">
             <wp:extent cx="5303520" cy="4143375"/>
-            <wp:docPr id="14" name="Picture 14"/>
+            <wp:docPr id="13" name="Picture 13"/>
             <wp:cNvGraphicFramePr>
               <a:graphicFrameLocks noChangeAspect="1"/>
             </wp:cNvGraphicFramePr>
@@ -12773,7 +12544,7 @@
                     <pic:cNvPicPr/>
                   </pic:nvPicPr>
                   <pic:blipFill>
-                    <a:blip r:embed="rId24"/>
+                    <a:blip r:embed="rId23"/>
                     <a:stretch>
                       <a:fillRect/>
                     </a:stretch>
@@ -12946,7 +12717,7 @@
         <w:drawing>
           <wp:inline xmlns:a="http://schemas.openxmlformats.org/drawingml/2006/main" xmlns:pic="http://schemas.openxmlformats.org/drawingml/2006/picture">
             <wp:extent cx="5303520" cy="9115425"/>
-            <wp:docPr id="15" name="Picture 15"/>
+            <wp:docPr id="14" name="Picture 14"/>
             <wp:cNvGraphicFramePr>
               <a:graphicFrameLocks noChangeAspect="1"/>
             </wp:cNvGraphicFramePr>
@@ -12958,7 +12729,7 @@
                     <pic:cNvPicPr/>
                   </pic:nvPicPr>
                   <pic:blipFill>
-                    <a:blip r:embed="rId25"/>
+                    <a:blip r:embed="rId24"/>
                     <a:stretch>
                       <a:fillRect/>
                     </a:stretch>
@@ -13244,7 +13015,7 @@
         <w:drawing>
           <wp:inline xmlns:a="http://schemas.openxmlformats.org/drawingml/2006/main" xmlns:pic="http://schemas.openxmlformats.org/drawingml/2006/picture">
             <wp:extent cx="5303520" cy="2386584"/>
-            <wp:docPr id="16" name="Picture 16"/>
+            <wp:docPr id="15" name="Picture 15"/>
             <wp:cNvGraphicFramePr>
               <a:graphicFrameLocks noChangeAspect="1"/>
             </wp:cNvGraphicFramePr>
@@ -13256,7 +13027,7 @@
                     <pic:cNvPicPr/>
                   </pic:nvPicPr>
                   <pic:blipFill>
-                    <a:blip r:embed="rId26"/>
+                    <a:blip r:embed="rId25"/>
                     <a:stretch>
                       <a:fillRect/>
                     </a:stretch>
@@ -16842,7 +16613,7 @@
               <w:drawing>
                 <wp:inline xmlns:a="http://schemas.openxmlformats.org/drawingml/2006/main" xmlns:pic="http://schemas.openxmlformats.org/drawingml/2006/picture">
                   <wp:extent cx="2834640" cy="1660922"/>
-                  <wp:docPr id="17" name="Picture 17"/>
+                  <wp:docPr id="16" name="Picture 16"/>
                   <wp:cNvGraphicFramePr>
                     <a:graphicFrameLocks noChangeAspect="1"/>
                   </wp:cNvGraphicFramePr>
@@ -16854,7 +16625,7 @@
                           <pic:cNvPicPr/>
                         </pic:nvPicPr>
                         <pic:blipFill>
-                          <a:blip r:embed="rId20"/>
+                          <a:blip r:embed="rId19"/>
                           <a:stretch>
                             <a:fillRect/>
                           </a:stretch>
@@ -16898,7 +16669,7 @@
               <w:drawing>
                 <wp:inline xmlns:a="http://schemas.openxmlformats.org/drawingml/2006/main" xmlns:pic="http://schemas.openxmlformats.org/drawingml/2006/picture">
                   <wp:extent cx="2834640" cy="1771650"/>
-                  <wp:docPr id="18" name="Picture 18"/>
+                  <wp:docPr id="17" name="Picture 17"/>
                   <wp:cNvGraphicFramePr>
                     <a:graphicFrameLocks noChangeAspect="1"/>
                   </wp:cNvGraphicFramePr>
@@ -16910,7 +16681,7 @@
                           <pic:cNvPicPr/>
                         </pic:nvPicPr>
                         <pic:blipFill>
-                          <a:blip r:embed="rId23"/>
+                          <a:blip r:embed="rId22"/>
                           <a:stretch>
                             <a:fillRect/>
                           </a:stretch>

</xml_diff>